<commit_message>
Update proposal and technical documents for the current build
Proposal now carries the 24 screens captured from the demo environment.
Architecture, handover, quality and security reports reflect CodeQL,
secret scanning and SBOM in CI, aligned API frame headers, mandatory
ClamAV in production, numbered EOD revisions, the renewal window,
automatic closure after a confirmed AML match, passport documents, web
tests and coverage measured over all API sources.
</commit_message>
<xml_diff>
--- a/docs/technical/SalesVerse-2.0-Production-Support-Handover.docx
+++ b/docs/technical/SalesVerse-2.0-Production-Support-Handover.docx
@@ -13112,7 +13112,51 @@
                 <w:i w:val="0"/>
                 <w:sz w:val="17"/>
               </w:rPr>
-              <w:t>Tell Finance that a fresh EOD_POSTING was sent for the date.</w:t>
+              <w:t>The new EOD_POSTING carries the next revision number, the idempotency key EOD-&lt;date&gt;-R&lt;n&gt; and replacesPreviousRevision=true when an earlier revision was sent, so FIN replaces the earlier revision for the date and ignores a repeated delivery of the same one.</w:t>
+            </w:r>
+          </w:p>
+        </w:tc>
+      </w:tr>
+      <w:tr>
+        <w:trPr>
+          <w:cantSplit/>
+        </w:trPr>
+        <w:tc>
+          <w:tcPr>
+            <w:tcW w:type="dxa" w:w="567"/>
+            <w:vAlign w:val="top"/>
+          </w:tcPr>
+          <w:p>
+            <w:pPr>
+              <w:spacing w:after="20" w:line="252" w:lineRule="auto"/>
+              <w:jc w:val="center"/>
+            </w:pPr>
+            <w:r>
+              <w:rPr>
+                <w:b w:val="0"/>
+                <w:i w:val="0"/>
+                <w:sz w:val="17"/>
+              </w:rPr>
+              <w:t>7</w:t>
+            </w:r>
+          </w:p>
+        </w:tc>
+        <w:tc>
+          <w:tcPr>
+            <w:tcW w:type="dxa" w:w="9071"/>
+            <w:vAlign w:val="top"/>
+          </w:tcPr>
+          <w:p>
+            <w:pPr>
+              <w:spacing w:after="20" w:line="252" w:lineRule="auto"/>
+            </w:pPr>
+            <w:r>
+              <w:rPr>
+                <w:b w:val="0"/>
+                <w:i w:val="0"/>
+                <w:sz w:val="17"/>
+              </w:rPr>
+              <w:t>Tell Finance which revision was sent for the date.</w:t>
             </w:r>
           </w:p>
         </w:tc>
@@ -19330,7 +19374,7 @@
                 <w:i w:val="0"/>
                 <w:sz w:val="15"/>
               </w:rPr>
-              <w:t>Optional</w:t>
+              <w:t>Required in production</w:t>
             </w:r>
           </w:p>
         </w:tc>
@@ -19349,7 +19393,7 @@
                 <w:i w:val="0"/>
                 <w:sz w:val="15"/>
               </w:rPr>
-              <w:t>clamd host for malware scanning of uploads; scanning is skipped when empty.</w:t>
+              <w:t>clamd host for malware scanning of uploads. When it is empty outside production, uploads are not scanned.</w:t>
             </w:r>
           </w:p>
         </w:tc>
@@ -31113,7 +31157,7 @@
           <w:b w:val="0"/>
           <w:i w:val="0"/>
         </w:rPr>
-        <w:t>Tests: unit tests next to the code (*.spec.ts); end-to-end tests in apps/api/test for new endpoints and permissions.</w:t>
+        <w:t>Tests: API unit tests next to the code (*.spec.ts); end-to-end tests in apps/api/test for new endpoints and permissions; web unit and component tests next to the code (*.test.ts, *.test.tsx) with Vitest and Testing Library. npm test --workspaces runs the API and web unit tests.</w:t>
       </w:r>
     </w:p>
     <w:p>

</xml_diff>